<commit_message>
Enhance documentation and diagrams to support multimodal input features, including same-person verification and gender consistency checks
</commit_message>
<xml_diff>
--- a/Multimodal_RAG_Haircut_Documentation.docx
+++ b/Multimodal_RAG_Haircut_Documentation.docx
@@ -191,7 +191,7 @@
           <w:sz w:val="22"/>
           <w:szCs w:val="22"/>
         </w:rPr>
-        <w:t xml:space="preserve">Recent advancements in Artificial Intelligence — specifically in the areas of Multimodal Large Language Models (LLMs), Retrieval-Augmented Generation (RAG), and vector-based semantic search — present an opportunity to bridge this gap. By combining computer vision-based feature extraction with a knowledge-grounded recommendation engine, it is now possible to build a system that delivers personalised, evidence-based haircut recommendations from a single photograph.</w:t>
+        <w:t xml:space="preserve">Recent advancements in Artificial Intelligence — specifically in the areas of Multimodal Large Language Models (LLMs), Retrieval-Augmented Generation (RAG), and vector-based semantic search — present an opportunity to bridge this gap. By combining computer vision-based feature extraction with a knowledge-grounded recommendation engine, it is now possible to build a system that delivers personalised, evidence-based haircut recommendations from a single photograph, a short face video, or a written self-description — or any combination of the three.</w:t>
       </w:r>
     </w:p>
     <w:p>
@@ -210,7 +210,7 @@
           <w:sz w:val="22"/>
           <w:szCs w:val="22"/>
         </w:rPr>
-        <w:t xml:space="preserve">This project proposes a Multimodal RAG system that accepts a facial image as input, extracts and classifies key physical features, and retrieves relevant haircut knowledge grounded in publicly accepted style guidance to generate a personalised recommendation. The system is built entirely on pretrained models and APIs, making it a practical and modern demonstration of LLM application engineering.</w:t>
+        <w:t xml:space="preserve">This project proposes a Multimodal RAG system that accepts a facial photo, a short face video, and/or a written self-description as input, extracts and classifies key physical features, and retrieves relevant haircut knowledge grounded in publicly accepted style guidance to generate a personalised recommendation. The system is built entirely on pretrained models and APIs, making it a practical and modern demonstration of LLM application engineering.</w:t>
       </w:r>
     </w:p>
     <w:p>
@@ -407,7 +407,7 @@
           <w:sz w:val="22"/>
           <w:szCs w:val="22"/>
         </w:rPr>
-        <w:t xml:space="preserve">In summary, there is a need for an intelligent system that can: (1) accept a facial image directly as input, (2) objectively extract and classify physical features, (3) retrieve grounded haircut knowledge aligned with those features, and (4) generate a personalised recommendation that reflects real-world public acceptance of haircut styles.</w:t>
+        <w:t xml:space="preserve">In summary, there is a need for an intelligent system that can: (1) accept multimodal input — a facial image, a short video, or a written description, alone or combined, (2) objectively extract and classify physical features, (3) retrieve grounded haircut knowledge aligned with those features, and (4) generate a personalised recommendation that reflects real-world public acceptance of haircut styles.</w:t>
       </w:r>
     </w:p>
     <w:p>
@@ -468,7 +468,7 @@
           <w:sz w:val="22"/>
           <w:szCs w:val="22"/>
         </w:rPr>
-        <w:t xml:space="preserve">To develop a multimodal image analysis module that utilises GPT-4o Vision to extract facial and hair features — including face shape, hair type, hair texture, and approximate gender — from a user-uploaded photograph.</w:t>
+        <w:t xml:space="preserve">To develop a multimodal image analysis module that utilises GPT-4o Vision to extract facial and hair features — including face shape, hair type, hair texture, and approximate gender — from a user-uploaded photograph or the sharpest frame automatically extracted from a short face video.</w:t>
       </w:r>
     </w:p>
     <w:p>
@@ -540,7 +540,7 @@
           <w:sz w:val="22"/>
           <w:szCs w:val="22"/>
         </w:rPr>
-        <w:t xml:space="preserve">To develop a user-facing web application using Streamlit that allows users to upload a photo and receive a structured haircut recommendation with minimal interaction.</w:t>
+        <w:t xml:space="preserve">To develop a user-facing web application using Streamlit that allows users to provide a photo, a short video, and/or a written description — in any combination — and receive a structured haircut recommendation with minimal interaction.</w:t>
       </w:r>
     </w:p>
     <w:p>
@@ -634,7 +634,7 @@
           <w:sz w:val="22"/>
           <w:szCs w:val="22"/>
         </w:rPr>
-        <w:t xml:space="preserve">Feature extraction using GPT-4o Vision API (face shape, hair type, hair texture)</w:t>
+        <w:t xml:space="preserve">Short face video input with automatic sharpest-frame extraction (OpenCV Laplacian variance)</w:t>
       </w:r>
     </w:p>
     <w:p>
@@ -652,7 +652,7 @@
           <w:sz w:val="22"/>
           <w:szCs w:val="22"/>
         </w:rPr>
-        <w:t xml:space="preserve">Classification of face shape into four classes: Oval, Round, Square, Heart</w:t>
+        <w:t xml:space="preserve">Free-text self-description input parsed into structured features by GPT-4o-mini</w:t>
       </w:r>
     </w:p>
     <w:p>
@@ -670,7 +670,7 @@
           <w:sz w:val="22"/>
           <w:szCs w:val="22"/>
         </w:rPr>
-        <w:t xml:space="preserve">Classification of hair type into four classes: Straight, Wavy, Curly, Coily</w:t>
+        <w:t xml:space="preserve">Multi-input feature merging (per-field majority vote; tie-break priority image &gt; video &gt; text)</w:t>
       </w:r>
     </w:p>
     <w:p>
@@ -688,7 +688,7 @@
           <w:sz w:val="22"/>
           <w:szCs w:val="22"/>
         </w:rPr>
-        <w:t xml:space="preserve">RAG knowledge base built from publicly available haircut style guides and trend articles</w:t>
+        <w:t xml:space="preserve">Cross-input consistency checks: GPT-4o same-person verification (photo vs video) and text/visual gender contradiction detection</w:t>
       </w:r>
     </w:p>
     <w:p>
@@ -706,7 +706,7 @@
           <w:sz w:val="22"/>
           <w:szCs w:val="22"/>
         </w:rPr>
-        <w:t xml:space="preserve">Vector indexing using FAISS and OpenAI text-embedding-3-small</w:t>
+        <w:t xml:space="preserve">Feature extraction using GPT-4o Vision API (face shape, hair type, hair texture)</w:t>
       </w:r>
     </w:p>
     <w:p>
@@ -724,7 +724,7 @@
           <w:sz w:val="22"/>
           <w:szCs w:val="22"/>
         </w:rPr>
-        <w:t xml:space="preserve">Recommendation generation using GPT-4o grounded in retrieved knowledge</w:t>
+        <w:t xml:space="preserve">Classification of face shape into four classes: Oval, Round, Square, Heart</w:t>
       </w:r>
     </w:p>
     <w:p>
@@ -742,7 +742,7 @@
           <w:sz w:val="22"/>
           <w:szCs w:val="22"/>
         </w:rPr>
-        <w:t xml:space="preserve">Streamlit web UI for end-to-end user interaction</w:t>
+        <w:t xml:space="preserve">Classification of hair type into four classes: Straight, Wavy, Curly, Coily</w:t>
       </w:r>
     </w:p>
     <w:p>
@@ -760,7 +760,7 @@
           <w:sz w:val="22"/>
           <w:szCs w:val="22"/>
         </w:rPr>
-        <w:t xml:space="preserve">Containerisation using Docker</w:t>
+        <w:t xml:space="preserve">RAG knowledge base built from publicly available haircut style guides and trend articles</w:t>
       </w:r>
     </w:p>
     <w:p>
@@ -778,28 +778,7 @@
           <w:sz w:val="22"/>
           <w:szCs w:val="22"/>
         </w:rPr>
-        <w:t xml:space="preserve">Cloud deployment on GCP Cloud Run</w:t>
-      </w:r>
-    </w:p>
-    <w:p>
-      <w:pPr>
-        <w:spacing w:after="80" w:before="80"/>
-      </w:pPr>
-    </w:p>
-    <w:p>
-      <w:pPr>
-        <w:pStyle w:val="Heading2"/>
-        <w:spacing w:after="120" w:before="280"/>
-        <w:rPr>
-          <w:b/>
-          <w:bCs/>
-          <w:color w:val="2563eb"/>
-          <w:sz w:val="24"/>
-          <w:szCs w:val="24"/>
-        </w:rPr>
-      </w:pPr>
-      <w:r>
-        <w:t xml:space="preserve">4.2 Out of Scope</w:t>
+        <w:t xml:space="preserve">Vector indexing using FAISS and OpenAI text-embedding-3-small</w:t>
       </w:r>
     </w:p>
     <w:p>
@@ -817,7 +796,7 @@
           <w:sz w:val="22"/>
           <w:szCs w:val="22"/>
         </w:rPr>
-        <w:t xml:space="preserve">Training a custom CNN or face shape classification model from scratch</w:t>
+        <w:t xml:space="preserve">Recommendation generation using GPT-4o grounded in retrieved knowledge</w:t>
       </w:r>
     </w:p>
     <w:p>
@@ -835,7 +814,7 @@
           <w:sz w:val="22"/>
           <w:szCs w:val="22"/>
         </w:rPr>
-        <w:t xml:space="preserve">Real-time video or camera stream input</w:t>
+        <w:t xml:space="preserve">Streamlit web UI for end-to-end user interaction</w:t>
       </w:r>
     </w:p>
     <w:p>
@@ -853,7 +832,7 @@
           <w:sz w:val="22"/>
           <w:szCs w:val="22"/>
         </w:rPr>
-        <w:t xml:space="preserve">E-commerce integration or haircut booking functionality</w:t>
+        <w:t xml:space="preserve">Containerisation using Docker</w:t>
       </w:r>
     </w:p>
     <w:p>
@@ -871,7 +850,28 @@
           <w:sz w:val="22"/>
           <w:szCs w:val="22"/>
         </w:rPr>
-        <w:t xml:space="preserve">Multi-language support (English only in this version)</w:t>
+        <w:t xml:space="preserve">Cloud deployment on GCP Cloud Run</w:t>
+      </w:r>
+    </w:p>
+    <w:p>
+      <w:pPr>
+        <w:spacing w:after="80" w:before="80"/>
+      </w:pPr>
+    </w:p>
+    <w:p>
+      <w:pPr>
+        <w:pStyle w:val="Heading2"/>
+        <w:spacing w:after="120" w:before="280"/>
+        <w:rPr>
+          <w:b/>
+          <w:bCs/>
+          <w:color w:val="2563eb"/>
+          <w:sz w:val="24"/>
+          <w:szCs w:val="24"/>
+        </w:rPr>
+      </w:pPr>
+      <w:r>
+        <w:t xml:space="preserve">4.2 Out of Scope</w:t>
       </w:r>
     </w:p>
     <w:p>
@@ -889,66 +889,7 @@
           <w:sz w:val="22"/>
           <w:szCs w:val="22"/>
         </w:rPr>
-        <w:t xml:space="preserve">Fine-tuning any LLM model</w:t>
-      </w:r>
-    </w:p>
-    <w:p>
-      <w:pPr>
-        <w:spacing w:after="80" w:before="80"/>
-      </w:pPr>
-    </w:p>
-    <w:p>
-      <w:pPr>
-        <w:pStyle w:val="Heading1"/>
-        <w:pBdr>
-          <w:bottom w:val="single" w:color="2563eb" w:sz="4"/>
-        </w:pBdr>
-        <w:spacing w:after="160" w:before="400"/>
-        <w:rPr>
-          <w:b/>
-          <w:bCs/>
-          <w:color w:val="1a1a2e"/>
-          <w:sz w:val="28"/>
-          <w:szCs w:val="28"/>
-        </w:rPr>
-      </w:pPr>
-      <w:r>
-        <w:t xml:space="preserve">5. Proposed System Architecture</w:t>
-      </w:r>
-    </w:p>
-    <w:p>
-      <w:pPr>
-        <w:spacing w:after="80" w:before="80"/>
-        <w:jc w:val="both"/>
-      </w:pPr>
-      <w:r>
-        <w:rPr>
-          <w:color w:val="1f2937"/>
-          <w:sz w:val="22"/>
-          <w:szCs w:val="22"/>
-        </w:rPr>
-        <w:t xml:space="preserve">The system is structured as a two-module pipeline:</w:t>
-      </w:r>
-    </w:p>
-    <w:p>
-      <w:pPr>
-        <w:spacing w:after="80" w:before="80"/>
-      </w:pPr>
-    </w:p>
-    <w:p>
-      <w:pPr>
-        <w:pStyle w:val="Heading2"/>
-        <w:spacing w:after="120" w:before="280"/>
-        <w:rPr>
-          <w:b/>
-          <w:bCs/>
-          <w:color w:val="2563eb"/>
-          <w:sz w:val="24"/>
-          <w:szCs w:val="24"/>
-        </w:rPr>
-      </w:pPr>
-      <w:r>
-        <w:t xml:space="preserve">Module 1 — Vision Analysis</w:t>
+        <w:t xml:space="preserve">Training a custom CNN or face shape classification model from scratch</w:t>
       </w:r>
     </w:p>
     <w:p>
@@ -966,7 +907,7 @@
           <w:sz w:val="22"/>
           <w:szCs w:val="22"/>
         </w:rPr>
-        <w:t xml:space="preserve">Input: User-uploaded facial photograph</w:t>
+        <w:t xml:space="preserve">Real-time camera stream input (uploaded video files are supported)</w:t>
       </w:r>
     </w:p>
     <w:p>
@@ -984,7 +925,7 @@
           <w:sz w:val="22"/>
           <w:szCs w:val="22"/>
         </w:rPr>
-        <w:t xml:space="preserve">Process: Image is encoded and submitted to GPT-4o Vision API with a structured feature extraction prompt</w:t>
+        <w:t xml:space="preserve">E-commerce integration or haircut booking functionality</w:t>
       </w:r>
     </w:p>
     <w:p>
@@ -1002,7 +943,138 @@
           <w:sz w:val="22"/>
           <w:szCs w:val="22"/>
         </w:rPr>
-        <w:t xml:space="preserve">Output: JSON object containing classified face shape, hair type, hair texture, and gender</w:t>
+        <w:t xml:space="preserve">Multi-language support (English only in this version)</w:t>
+      </w:r>
+    </w:p>
+    <w:p>
+      <w:pPr>
+        <w:pStyle w:val="ListParagraph"/>
+        <w:numPr>
+          <w:ilvl w:val="0"/>
+          <w:numId w:val="2"/>
+        </w:numPr>
+        <w:spacing w:after="60" w:before="60"/>
+      </w:pPr>
+      <w:r>
+        <w:rPr>
+          <w:color w:val="1f2937"/>
+          <w:sz w:val="22"/>
+          <w:szCs w:val="22"/>
+        </w:rPr>
+        <w:t xml:space="preserve">Fine-tuning any LLM model</w:t>
+      </w:r>
+    </w:p>
+    <w:p>
+      <w:pPr>
+        <w:spacing w:after="80" w:before="80"/>
+      </w:pPr>
+    </w:p>
+    <w:p>
+      <w:pPr>
+        <w:pStyle w:val="Heading1"/>
+        <w:pBdr>
+          <w:bottom w:val="single" w:color="2563eb" w:sz="4"/>
+        </w:pBdr>
+        <w:spacing w:after="160" w:before="400"/>
+        <w:rPr>
+          <w:b/>
+          <w:bCs/>
+          <w:color w:val="1a1a2e"/>
+          <w:sz w:val="28"/>
+          <w:szCs w:val="28"/>
+        </w:rPr>
+      </w:pPr>
+      <w:r>
+        <w:t xml:space="preserve">5. Proposed System Architecture</w:t>
+      </w:r>
+    </w:p>
+    <w:p>
+      <w:pPr>
+        <w:spacing w:after="80" w:before="80"/>
+        <w:jc w:val="both"/>
+      </w:pPr>
+      <w:r>
+        <w:rPr>
+          <w:color w:val="1f2937"/>
+          <w:sz w:val="22"/>
+          <w:szCs w:val="22"/>
+        </w:rPr>
+        <w:t xml:space="preserve">The system is structured as a service-orchestrated pipeline: the Streamlit presentation layer calls a single service entry point (services/pipeline.py), which validates each provided input, routes it to its handler (image, video, or text), verifies cross-input consistency, merges the extracted features, and then runs the two core modules below:</w:t>
+      </w:r>
+    </w:p>
+    <w:p>
+      <w:pPr>
+        <w:spacing w:after="80" w:before="80"/>
+      </w:pPr>
+    </w:p>
+    <w:p>
+      <w:pPr>
+        <w:pStyle w:val="Heading2"/>
+        <w:spacing w:after="120" w:before="280"/>
+        <w:rPr>
+          <w:b/>
+          <w:bCs/>
+          <w:color w:val="2563eb"/>
+          <w:sz w:val="24"/>
+          <w:szCs w:val="24"/>
+        </w:rPr>
+      </w:pPr>
+      <w:r>
+        <w:t xml:space="preserve">Module 1 — Vision Analysis</w:t>
+      </w:r>
+    </w:p>
+    <w:p>
+      <w:pPr>
+        <w:pStyle w:val="ListParagraph"/>
+        <w:numPr>
+          <w:ilvl w:val="0"/>
+          <w:numId w:val="2"/>
+        </w:numPr>
+        <w:spacing w:after="60" w:before="60"/>
+      </w:pPr>
+      <w:r>
+        <w:rPr>
+          <w:color w:val="1f2937"/>
+          <w:sz w:val="22"/>
+          <w:szCs w:val="22"/>
+        </w:rPr>
+        <w:t xml:space="preserve">Input: User-uploaded facial photograph and/or the sharpest frame automatically extracted from a short face video (OpenCV, Laplacian-variance sampling)</w:t>
+      </w:r>
+    </w:p>
+    <w:p>
+      <w:pPr>
+        <w:pStyle w:val="ListParagraph"/>
+        <w:numPr>
+          <w:ilvl w:val="0"/>
+          <w:numId w:val="2"/>
+        </w:numPr>
+        <w:spacing w:after="60" w:before="60"/>
+      </w:pPr>
+      <w:r>
+        <w:rPr>
+          <w:color w:val="1f2937"/>
+          <w:sz w:val="22"/>
+          <w:szCs w:val="22"/>
+        </w:rPr>
+        <w:t xml:space="preserve">Process: Image is encoded and submitted to GPT-4o Vision API with a structured feature extraction prompt</w:t>
+      </w:r>
+    </w:p>
+    <w:p>
+      <w:pPr>
+        <w:pStyle w:val="ListParagraph"/>
+        <w:numPr>
+          <w:ilvl w:val="0"/>
+          <w:numId w:val="2"/>
+        </w:numPr>
+        <w:spacing w:after="60" w:before="60"/>
+      </w:pPr>
+      <w:r>
+        <w:rPr>
+          <w:color w:val="1f2937"/>
+          <w:sz w:val="22"/>
+          <w:szCs w:val="22"/>
+        </w:rPr>
+        <w:t xml:space="preserve">Output: JSON object containing classified face shape, hair type, hair texture, and gender. A free-text self-description, if provided, is parsed into the same structure by GPT-4o-mini. When both a photo and a video are supplied, GPT-4o first verifies they show the same person (mismatches are rejected with an error); a gender contradiction between the text description and the photo/video is likewise rejected. Features from all inputs are then merged per field by majority vote (tie-break priority: image &gt; video &gt; text)</w:t>
       </w:r>
     </w:p>
     <w:p>
@@ -1394,6 +1466,334 @@
                 <w:szCs w:val="20"/>
               </w:rPr>
               <w:t xml:space="preserve">Format image for API payload</w:t>
+            </w:r>
+          </w:p>
+        </w:tc>
+      </w:tr>
+      <w:tr>
+        <w:tc>
+          <w:tcPr>
+            <w:tcW w:type="dxa" w:w="2340"/>
+            <w:shd w:fill="FFFFFF" w:val="clear"/>
+          </w:tcPr>
+          <w:p>
+            <w:pPr>
+              <w:spacing w:after="60" w:before="60"/>
+              <w:jc w:val="left"/>
+            </w:pPr>
+            <w:r>
+              <w:rPr>
+                <w:color w:val="1f2937"/>
+                <w:sz w:val="20"/>
+                <w:szCs w:val="20"/>
+              </w:rPr>
+              <w:t xml:space="preserve">Video Input</w:t>
+            </w:r>
+          </w:p>
+        </w:tc>
+        <w:tc>
+          <w:tcPr>
+            <w:tcW w:type="dxa" w:w="2340"/>
+            <w:shd w:fill="FFFFFF" w:val="clear"/>
+          </w:tcPr>
+          <w:p>
+            <w:pPr>
+              <w:spacing w:after="60" w:before="60"/>
+              <w:jc w:val="left"/>
+            </w:pPr>
+            <w:r>
+              <w:rPr>
+                <w:color w:val="1f2937"/>
+                <w:sz w:val="20"/>
+                <w:szCs w:val="20"/>
+              </w:rPr>
+              <w:t xml:space="preserve">OpenCV</w:t>
+            </w:r>
+          </w:p>
+        </w:tc>
+        <w:tc>
+          <w:tcPr>
+            <w:tcW w:type="dxa" w:w="2340"/>
+            <w:shd w:fill="FFFFFF" w:val="clear"/>
+          </w:tcPr>
+          <w:p>
+            <w:pPr>
+              <w:spacing w:after="60" w:before="60"/>
+              <w:jc w:val="left"/>
+            </w:pPr>
+            <w:r>
+              <w:rPr>
+                <w:color w:val="1f2937"/>
+                <w:sz w:val="20"/>
+                <w:szCs w:val="20"/>
+              </w:rPr>
+              <w:t xml:space="preserve">Laplacian Variance Scoring</w:t>
+            </w:r>
+          </w:p>
+        </w:tc>
+        <w:tc>
+          <w:tcPr>
+            <w:tcW w:type="dxa" w:w="2340"/>
+            <w:shd w:fill="FFFFFF" w:val="clear"/>
+          </w:tcPr>
+          <w:p>
+            <w:pPr>
+              <w:spacing w:after="60" w:before="60"/>
+              <w:jc w:val="left"/>
+            </w:pPr>
+            <w:r>
+              <w:rPr>
+                <w:color w:val="1f2937"/>
+                <w:sz w:val="20"/>
+                <w:szCs w:val="20"/>
+              </w:rPr>
+              <w:t xml:space="preserve">Extract sharpest frame from video</w:t>
+            </w:r>
+          </w:p>
+        </w:tc>
+      </w:tr>
+      <w:tr>
+        <w:tc>
+          <w:tcPr>
+            <w:tcW w:type="dxa" w:w="2340"/>
+            <w:shd w:fill="FFFFFF" w:val="clear"/>
+          </w:tcPr>
+          <w:p>
+            <w:pPr>
+              <w:spacing w:after="60" w:before="60"/>
+              <w:jc w:val="left"/>
+            </w:pPr>
+            <w:r>
+              <w:rPr>
+                <w:color w:val="1f2937"/>
+                <w:sz w:val="20"/>
+                <w:szCs w:val="20"/>
+              </w:rPr>
+              <w:t xml:space="preserve">Text Input</w:t>
+            </w:r>
+          </w:p>
+        </w:tc>
+        <w:tc>
+          <w:tcPr>
+            <w:tcW w:type="dxa" w:w="2340"/>
+            <w:shd w:fill="FFFFFF" w:val="clear"/>
+          </w:tcPr>
+          <w:p>
+            <w:pPr>
+              <w:spacing w:after="60" w:before="60"/>
+              <w:jc w:val="left"/>
+            </w:pPr>
+            <w:r>
+              <w:rPr>
+                <w:color w:val="1f2937"/>
+                <w:sz w:val="20"/>
+                <w:szCs w:val="20"/>
+              </w:rPr>
+              <w:t xml:space="preserve">GPT-4o-mini</w:t>
+            </w:r>
+          </w:p>
+        </w:tc>
+        <w:tc>
+          <w:tcPr>
+            <w:tcW w:type="dxa" w:w="2340"/>
+            <w:shd w:fill="FFFFFF" w:val="clear"/>
+          </w:tcPr>
+          <w:p>
+            <w:pPr>
+              <w:spacing w:after="60" w:before="60"/>
+              <w:jc w:val="left"/>
+            </w:pPr>
+            <w:r>
+              <w:rPr>
+                <w:color w:val="1f2937"/>
+                <w:sz w:val="20"/>
+                <w:szCs w:val="20"/>
+              </w:rPr>
+              <w:t xml:space="preserve">Structured JSON Parsing</w:t>
+            </w:r>
+          </w:p>
+        </w:tc>
+        <w:tc>
+          <w:tcPr>
+            <w:tcW w:type="dxa" w:w="2340"/>
+            <w:shd w:fill="FFFFFF" w:val="clear"/>
+          </w:tcPr>
+          <w:p>
+            <w:pPr>
+              <w:spacing w:after="60" w:before="60"/>
+              <w:jc w:val="left"/>
+            </w:pPr>
+            <w:r>
+              <w:rPr>
+                <w:color w:val="1f2937"/>
+                <w:sz w:val="20"/>
+                <w:szCs w:val="20"/>
+              </w:rPr>
+              <w:t xml:space="preserve">Parse self-description into features</w:t>
+            </w:r>
+          </w:p>
+        </w:tc>
+      </w:tr>
+      <w:tr>
+        <w:tc>
+          <w:tcPr>
+            <w:tcW w:type="dxa" w:w="2340"/>
+            <w:shd w:fill="FFFFFF" w:val="clear"/>
+          </w:tcPr>
+          <w:p>
+            <w:pPr>
+              <w:spacing w:after="60" w:before="60"/>
+              <w:jc w:val="left"/>
+            </w:pPr>
+            <w:r>
+              <w:rPr>
+                <w:color w:val="1f2937"/>
+                <w:sz w:val="20"/>
+                <w:szCs w:val="20"/>
+              </w:rPr>
+              <w:t xml:space="preserve">Consistency</w:t>
+            </w:r>
+          </w:p>
+        </w:tc>
+        <w:tc>
+          <w:tcPr>
+            <w:tcW w:type="dxa" w:w="2340"/>
+            <w:shd w:fill="FFFFFF" w:val="clear"/>
+          </w:tcPr>
+          <w:p>
+            <w:pPr>
+              <w:spacing w:after="60" w:before="60"/>
+              <w:jc w:val="left"/>
+            </w:pPr>
+            <w:r>
+              <w:rPr>
+                <w:color w:val="1f2937"/>
+                <w:sz w:val="20"/>
+                <w:szCs w:val="20"/>
+              </w:rPr>
+              <w:t xml:space="preserve">GPT-4o Vision</w:t>
+            </w:r>
+          </w:p>
+        </w:tc>
+        <w:tc>
+          <w:tcPr>
+            <w:tcW w:type="dxa" w:w="2340"/>
+            <w:shd w:fill="FFFFFF" w:val="clear"/>
+          </w:tcPr>
+          <w:p>
+            <w:pPr>
+              <w:spacing w:after="60" w:before="60"/>
+              <w:jc w:val="left"/>
+            </w:pPr>
+            <w:r>
+              <w:rPr>
+                <w:color w:val="1f2937"/>
+                <w:sz w:val="20"/>
+                <w:szCs w:val="20"/>
+              </w:rPr>
+              <w:t xml:space="preserve">Same-Person Verification</w:t>
+            </w:r>
+          </w:p>
+        </w:tc>
+        <w:tc>
+          <w:tcPr>
+            <w:tcW w:type="dxa" w:w="2340"/>
+            <w:shd w:fill="FFFFFF" w:val="clear"/>
+          </w:tcPr>
+          <w:p>
+            <w:pPr>
+              <w:spacing w:after="60" w:before="60"/>
+              <w:jc w:val="left"/>
+            </w:pPr>
+            <w:r>
+              <w:rPr>
+                <w:color w:val="1f2937"/>
+                <w:sz w:val="20"/>
+                <w:szCs w:val="20"/>
+              </w:rPr>
+              <w:t xml:space="preserve">Reject mismatched photo/video</w:t>
+            </w:r>
+          </w:p>
+        </w:tc>
+      </w:tr>
+      <w:tr>
+        <w:tc>
+          <w:tcPr>
+            <w:tcW w:type="dxa" w:w="2340"/>
+            <w:shd w:fill="FFFFFF" w:val="clear"/>
+          </w:tcPr>
+          <w:p>
+            <w:pPr>
+              <w:spacing w:after="60" w:before="60"/>
+              <w:jc w:val="left"/>
+            </w:pPr>
+            <w:r>
+              <w:rPr>
+                <w:color w:val="1f2937"/>
+                <w:sz w:val="20"/>
+                <w:szCs w:val="20"/>
+              </w:rPr>
+              <w:t xml:space="preserve">Feature Merging</w:t>
+            </w:r>
+          </w:p>
+        </w:tc>
+        <w:tc>
+          <w:tcPr>
+            <w:tcW w:type="dxa" w:w="2340"/>
+            <w:shd w:fill="FFFFFF" w:val="clear"/>
+          </w:tcPr>
+          <w:p>
+            <w:pPr>
+              <w:spacing w:after="60" w:before="60"/>
+              <w:jc w:val="left"/>
+            </w:pPr>
+            <w:r>
+              <w:rPr>
+                <w:color w:val="1f2937"/>
+                <w:sz w:val="20"/>
+                <w:szCs w:val="20"/>
+              </w:rPr>
+              <w:t xml:space="preserve">Majority Vote + Priority</w:t>
+            </w:r>
+          </w:p>
+        </w:tc>
+        <w:tc>
+          <w:tcPr>
+            <w:tcW w:type="dxa" w:w="2340"/>
+            <w:shd w:fill="FFFFFF" w:val="clear"/>
+          </w:tcPr>
+          <w:p>
+            <w:pPr>
+              <w:spacing w:after="60" w:before="60"/>
+              <w:jc w:val="left"/>
+            </w:pPr>
+            <w:r>
+              <w:rPr>
+                <w:color w:val="1f2937"/>
+                <w:sz w:val="20"/>
+                <w:szCs w:val="20"/>
+              </w:rPr>
+              <w:t xml:space="preserve">Multi-Modal Feature Fusion</w:t>
+            </w:r>
+          </w:p>
+        </w:tc>
+        <w:tc>
+          <w:tcPr>
+            <w:tcW w:type="dxa" w:w="2340"/>
+            <w:shd w:fill="FFFFFF" w:val="clear"/>
+          </w:tcPr>
+          <w:p>
+            <w:pPr>
+              <w:spacing w:after="60" w:before="60"/>
+              <w:jc w:val="left"/>
+            </w:pPr>
+            <w:r>
+              <w:rPr>
+                <w:color w:val="1f2937"/>
+                <w:sz w:val="20"/>
+                <w:szCs w:val="20"/>
+              </w:rPr>
+              <w:t xml:space="preserve">Combine features from all inputs</w:t>
             </w:r>
           </w:p>
         </w:tc>

</xml_diff>

<commit_message>
Enhance feedback handling to persist user suggestions in Firestore, with CSV fallback; update documentation and tests for new functionality
</commit_message>
<xml_diff>
--- a/Multimodal_RAG_Haircut_Documentation.docx
+++ b/Multimodal_RAG_Haircut_Documentation.docx
@@ -832,7 +832,7 @@
           <w:sz w:val="22"/>
           <w:szCs w:val="22"/>
         </w:rPr>
-        <w:t xml:space="preserve">Containerisation using Docker</w:t>
+        <w:t xml:space="preserve">Reference haircut style images displayed alongside recommendations, matched by style name and gender (services/style_images.py)</w:t>
       </w:r>
     </w:p>
     <w:p>
@@ -850,28 +850,7 @@
           <w:sz w:val="22"/>
           <w:szCs w:val="22"/>
         </w:rPr>
-        <w:t xml:space="preserve">Cloud deployment on GCP Cloud Run</w:t>
-      </w:r>
-    </w:p>
-    <w:p>
-      <w:pPr>
-        <w:spacing w:after="80" w:before="80"/>
-      </w:pPr>
-    </w:p>
-    <w:p>
-      <w:pPr>
-        <w:pStyle w:val="Heading2"/>
-        <w:spacing w:after="120" w:before="280"/>
-        <w:rPr>
-          <w:b/>
-          <w:bCs/>
-          <w:color w:val="2563eb"/>
-          <w:sz w:val="24"/>
-          <w:szCs w:val="24"/>
-        </w:rPr>
-      </w:pPr>
-      <w:r>
-        <w:t xml:space="preserve">4.2 Out of Scope</w:t>
+        <w:t xml:space="preserve">Containerisation using Docker</w:t>
       </w:r>
     </w:p>
     <w:p>
@@ -889,7 +868,28 @@
           <w:sz w:val="22"/>
           <w:szCs w:val="22"/>
         </w:rPr>
-        <w:t xml:space="preserve">Training a custom CNN or face shape classification model from scratch</w:t>
+        <w:t xml:space="preserve">Cloud deployment on GCP Cloud Run</w:t>
+      </w:r>
+    </w:p>
+    <w:p>
+      <w:pPr>
+        <w:spacing w:after="80" w:before="80"/>
+      </w:pPr>
+    </w:p>
+    <w:p>
+      <w:pPr>
+        <w:pStyle w:val="Heading2"/>
+        <w:spacing w:after="120" w:before="280"/>
+        <w:rPr>
+          <w:b/>
+          <w:bCs/>
+          <w:color w:val="2563eb"/>
+          <w:sz w:val="24"/>
+          <w:szCs w:val="24"/>
+        </w:rPr>
+      </w:pPr>
+      <w:r>
+        <w:t xml:space="preserve">4.2 Out of Scope</w:t>
       </w:r>
     </w:p>
     <w:p>
@@ -907,7 +907,7 @@
           <w:sz w:val="22"/>
           <w:szCs w:val="22"/>
         </w:rPr>
-        <w:t xml:space="preserve">Real-time camera stream input (uploaded video files are supported)</w:t>
+        <w:t xml:space="preserve">Training a custom CNN or face shape classification model from scratch</w:t>
       </w:r>
     </w:p>
     <w:p>
@@ -925,7 +925,7 @@
           <w:sz w:val="22"/>
           <w:szCs w:val="22"/>
         </w:rPr>
-        <w:t xml:space="preserve">E-commerce integration or haircut booking functionality</w:t>
+        <w:t xml:space="preserve">Real-time camera stream input (uploaded video files are supported)</w:t>
       </w:r>
     </w:p>
     <w:p>
@@ -943,7 +943,7 @@
           <w:sz w:val="22"/>
           <w:szCs w:val="22"/>
         </w:rPr>
-        <w:t xml:space="preserve">Multi-language support (English only in this version)</w:t>
+        <w:t xml:space="preserve">E-commerce integration or haircut booking functionality</w:t>
       </w:r>
     </w:p>
     <w:p>
@@ -961,66 +961,7 @@
           <w:sz w:val="22"/>
           <w:szCs w:val="22"/>
         </w:rPr>
-        <w:t xml:space="preserve">Fine-tuning any LLM model</w:t>
-      </w:r>
-    </w:p>
-    <w:p>
-      <w:pPr>
-        <w:spacing w:after="80" w:before="80"/>
-      </w:pPr>
-    </w:p>
-    <w:p>
-      <w:pPr>
-        <w:pStyle w:val="Heading1"/>
-        <w:pBdr>
-          <w:bottom w:val="single" w:color="2563eb" w:sz="4"/>
-        </w:pBdr>
-        <w:spacing w:after="160" w:before="400"/>
-        <w:rPr>
-          <w:b/>
-          <w:bCs/>
-          <w:color w:val="1a1a2e"/>
-          <w:sz w:val="28"/>
-          <w:szCs w:val="28"/>
-        </w:rPr>
-      </w:pPr>
-      <w:r>
-        <w:t xml:space="preserve">5. Proposed System Architecture</w:t>
-      </w:r>
-    </w:p>
-    <w:p>
-      <w:pPr>
-        <w:spacing w:after="80" w:before="80"/>
-        <w:jc w:val="both"/>
-      </w:pPr>
-      <w:r>
-        <w:rPr>
-          <w:color w:val="1f2937"/>
-          <w:sz w:val="22"/>
-          <w:szCs w:val="22"/>
-        </w:rPr>
-        <w:t xml:space="preserve">The system is structured as a service-orchestrated pipeline: the Streamlit presentation layer calls a single service entry point (services/pipeline.py), which validates each provided input, routes it to its handler (image, video, or text), verifies cross-input consistency, merges the extracted features, and then runs the two core modules below:</w:t>
-      </w:r>
-    </w:p>
-    <w:p>
-      <w:pPr>
-        <w:spacing w:after="80" w:before="80"/>
-      </w:pPr>
-    </w:p>
-    <w:p>
-      <w:pPr>
-        <w:pStyle w:val="Heading2"/>
-        <w:spacing w:after="120" w:before="280"/>
-        <w:rPr>
-          <w:b/>
-          <w:bCs/>
-          <w:color w:val="2563eb"/>
-          <w:sz w:val="24"/>
-          <w:szCs w:val="24"/>
-        </w:rPr>
-      </w:pPr>
-      <w:r>
-        <w:t xml:space="preserve">Module 1 — Vision Analysis</w:t>
+        <w:t xml:space="preserve">Multi-language support (English only in this version)</w:t>
       </w:r>
     </w:p>
     <w:p>
@@ -1038,7 +979,66 @@
           <w:sz w:val="22"/>
           <w:szCs w:val="22"/>
         </w:rPr>
-        <w:t xml:space="preserve">Input: User-uploaded facial photograph and/or the sharpest frame automatically extracted from a short face video (OpenCV, Laplacian-variance sampling)</w:t>
+        <w:t xml:space="preserve">Fine-tuning any LLM model</w:t>
+      </w:r>
+    </w:p>
+    <w:p>
+      <w:pPr>
+        <w:spacing w:after="80" w:before="80"/>
+      </w:pPr>
+    </w:p>
+    <w:p>
+      <w:pPr>
+        <w:pStyle w:val="Heading1"/>
+        <w:pBdr>
+          <w:bottom w:val="single" w:color="2563eb" w:sz="4"/>
+        </w:pBdr>
+        <w:spacing w:after="160" w:before="400"/>
+        <w:rPr>
+          <w:b/>
+          <w:bCs/>
+          <w:color w:val="1a1a2e"/>
+          <w:sz w:val="28"/>
+          <w:szCs w:val="28"/>
+        </w:rPr>
+      </w:pPr>
+      <w:r>
+        <w:t xml:space="preserve">5. Proposed System Architecture</w:t>
+      </w:r>
+    </w:p>
+    <w:p>
+      <w:pPr>
+        <w:spacing w:after="80" w:before="80"/>
+        <w:jc w:val="both"/>
+      </w:pPr>
+      <w:r>
+        <w:rPr>
+          <w:color w:val="1f2937"/>
+          <w:sz w:val="22"/>
+          <w:szCs w:val="22"/>
+        </w:rPr>
+        <w:t xml:space="preserve">The system is structured as a service-orchestrated pipeline: the Streamlit presentation layer calls a single service entry point (services/pipeline.py), which validates each provided input, routes it to its handler (image, video, or text), verifies cross-input consistency, merges the extracted features, and then runs the two core modules below:</w:t>
+      </w:r>
+    </w:p>
+    <w:p>
+      <w:pPr>
+        <w:spacing w:after="80" w:before="80"/>
+      </w:pPr>
+    </w:p>
+    <w:p>
+      <w:pPr>
+        <w:pStyle w:val="Heading2"/>
+        <w:spacing w:after="120" w:before="280"/>
+        <w:rPr>
+          <w:b/>
+          <w:bCs/>
+          <w:color w:val="2563eb"/>
+          <w:sz w:val="24"/>
+          <w:szCs w:val="24"/>
+        </w:rPr>
+      </w:pPr>
+      <w:r>
+        <w:t xml:space="preserve">Module 1 — Vision Analysis</w:t>
       </w:r>
     </w:p>
     <w:p>
@@ -1056,7 +1056,7 @@
           <w:sz w:val="22"/>
           <w:szCs w:val="22"/>
         </w:rPr>
-        <w:t xml:space="preserve">Process: Image is encoded and submitted to GPT-4o Vision API with a structured feature extraction prompt</w:t>
+        <w:t xml:space="preserve">Input: User-uploaded facial photograph and/or the sharpest frame automatically extracted from a short face video (OpenCV, Laplacian-variance sampling)</w:t>
       </w:r>
     </w:p>
     <w:p>
@@ -1074,28 +1074,7 @@
           <w:sz w:val="22"/>
           <w:szCs w:val="22"/>
         </w:rPr>
-        <w:t xml:space="preserve">Output: JSON object containing classified face shape, hair type, hair texture, and gender. A free-text self-description, if provided, is parsed into the same structure by GPT-4o-mini. When both a photo and a video are supplied, GPT-4o first verifies they show the same person (mismatches are rejected with an error); a gender contradiction between the text description and the photo/video is likewise rejected. Features from all inputs are then merged per field by majority vote (tie-break priority: image &gt; video &gt; text)</w:t>
-      </w:r>
-    </w:p>
-    <w:p>
-      <w:pPr>
-        <w:spacing w:after="80" w:before="80"/>
-      </w:pPr>
-    </w:p>
-    <w:p>
-      <w:pPr>
-        <w:pStyle w:val="Heading2"/>
-        <w:spacing w:after="120" w:before="280"/>
-        <w:rPr>
-          <w:b/>
-          <w:bCs/>
-          <w:color w:val="2563eb"/>
-          <w:sz w:val="24"/>
-          <w:szCs w:val="24"/>
-        </w:rPr>
-      </w:pPr>
-      <w:r>
-        <w:t xml:space="preserve">Module 2 — RAG Recommendation</w:t>
+        <w:t xml:space="preserve">Process: Image is encoded and submitted to GPT-4o Vision API with a structured feature extraction prompt</w:t>
       </w:r>
     </w:p>
     <w:p>
@@ -1113,7 +1092,28 @@
           <w:sz w:val="22"/>
           <w:szCs w:val="22"/>
         </w:rPr>
-        <w:t xml:space="preserve">Input: Structured feature JSON from Module 1</w:t>
+        <w:t xml:space="preserve">Output: JSON object containing classified face shape, hair type, hair texture, and gender. A free-text self-description, if provided, is parsed into the same structure by GPT-4o-mini. When both a photo and a video are supplied, GPT-4o first verifies they show the same person (mismatches are rejected with an error); a gender contradiction between the text description and the photo/video is likewise rejected. Features from all inputs are then merged per field by majority vote (tie-break priority: image &gt; video &gt; text)</w:t>
+      </w:r>
+    </w:p>
+    <w:p>
+      <w:pPr>
+        <w:spacing w:after="80" w:before="80"/>
+      </w:pPr>
+    </w:p>
+    <w:p>
+      <w:pPr>
+        <w:pStyle w:val="Heading2"/>
+        <w:spacing w:after="120" w:before="280"/>
+        <w:rPr>
+          <w:b/>
+          <w:bCs/>
+          <w:color w:val="2563eb"/>
+          <w:sz w:val="24"/>
+          <w:szCs w:val="24"/>
+        </w:rPr>
+      </w:pPr>
+      <w:r>
+        <w:t xml:space="preserve">Module 2 — RAG Recommendation</w:t>
       </w:r>
     </w:p>
     <w:p>
@@ -1131,7 +1131,7 @@
           <w:sz w:val="22"/>
           <w:szCs w:val="22"/>
         </w:rPr>
-        <w:t xml:space="preserve">Process: Features are converted into a semantic query via LangChain PromptTemplate, which retrieves the top-K relevant knowledge chunks from FAISS, and passes them to GPT-4o for recommendation generation</w:t>
+        <w:t xml:space="preserve">Input: Structured feature JSON from Module 1</w:t>
       </w:r>
     </w:p>
     <w:p>
@@ -1149,7 +1149,25 @@
           <w:sz w:val="22"/>
           <w:szCs w:val="22"/>
         </w:rPr>
-        <w:t xml:space="preserve">Output: Personalised haircut recommendation grounded in retrieved public knowledge</w:t>
+        <w:t xml:space="preserve">Process: Features are converted into a semantic query via LangChain PromptTemplate, which retrieves the top-K relevant knowledge chunks from FAISS, and passes them to GPT-4o for recommendation generation</w:t>
+      </w:r>
+    </w:p>
+    <w:p>
+      <w:pPr>
+        <w:pStyle w:val="ListParagraph"/>
+        <w:numPr>
+          <w:ilvl w:val="0"/>
+          <w:numId w:val="2"/>
+        </w:numPr>
+        <w:spacing w:after="60" w:before="60"/>
+      </w:pPr>
+      <w:r>
+        <w:rPr>
+          <w:color w:val="1f2937"/>
+          <w:sz w:val="22"/>
+          <w:szCs w:val="22"/>
+        </w:rPr>
+        <w:t>Output: Personalised haircut recommendation grounded in retrieved public knowledge, plus up to three gender-matched reference style images (services/style_images.py)</w:t>
       </w:r>
     </w:p>
     <w:p>
@@ -3357,6 +3375,24 @@
           <w:szCs w:val="22"/>
         </w:rPr>
         <w:t xml:space="preserve">A haircut recommendation engine that produces personalised, document-grounded outputs based on facial image input</w:t>
+      </w:r>
+    </w:p>
+    <w:p>
+      <w:pPr>
+        <w:pStyle w:val="ListParagraph"/>
+        <w:numPr>
+          <w:ilvl w:val="0"/>
+          <w:numId w:val="2"/>
+        </w:numPr>
+        <w:spacing w:after="60" w:before="60"/>
+      </w:pPr>
+      <w:r>
+        <w:rPr>
+          <w:color w:val="1f2937"/>
+          <w:sz w:val="22"/>
+          <w:szCs w:val="22"/>
+        </w:rPr>
+        <w:t xml:space="preserve">A visual style reference gallery that surfaces up to three gender-matched haircut images alongside each recommendation</w:t>
       </w:r>
     </w:p>
     <w:p>

</xml_diff>